<commit_message>
informe de proyecto , concluciones
</commit_message>
<xml_diff>
--- a/Informe_Parking_Coto.docx
+++ b/Informe_Parking_Coto.docx
@@ -721,12 +721,6 @@
         <w:gridCol w:w="2000"/>
       </w:tblGrid>
       <w:tr>
-        <w:tblPrEx>
-          <w:tblCellMar>
-            <w:top w:w="0" w:type="dxa"/>
-            <w:bottom w:w="0" w:type="dxa"/>
-          </w:tblCellMar>
-        </w:tblPrEx>
         <w:trPr>
           <w:cantSplit/>
           <w:tblHeader/>
@@ -975,12 +969,6 @@
         </w:tc>
       </w:tr>
       <w:tr>
-        <w:tblPrEx>
-          <w:tblCellMar>
-            <w:top w:w="0" w:type="dxa"/>
-            <w:bottom w:w="0" w:type="dxa"/>
-          </w:tblCellMar>
-        </w:tblPrEx>
         <w:trPr>
           <w:cantSplit/>
         </w:trPr>
@@ -1078,7 +1066,15 @@
                 <w:sz w:val="24"/>
                 <w:szCs w:val="24"/>
               </w:rPr>
-              <w:t>₡500</w:t>
+              <w:t>₡</w:t>
+            </w:r>
+            <w:r>
+              <w:rPr>
+                <w:rFonts w:ascii="Times New Roman" w:hAnsi="Times New Roman" w:cs="Times New Roman"/>
+                <w:sz w:val="24"/>
+                <w:szCs w:val="24"/>
+              </w:rPr>
+              <w:t>500</w:t>
             </w:r>
           </w:p>
         </w:tc>
@@ -1114,7 +1110,15 @@
                 <w:sz w:val="24"/>
                 <w:szCs w:val="24"/>
               </w:rPr>
-              <w:t>₡4 000</w:t>
+              <w:t>₡</w:t>
+            </w:r>
+            <w:r>
+              <w:rPr>
+                <w:rFonts w:ascii="Times New Roman" w:hAnsi="Times New Roman" w:cs="Times New Roman"/>
+                <w:sz w:val="24"/>
+                <w:szCs w:val="24"/>
+              </w:rPr>
+              <w:t>4 000</w:t>
             </w:r>
           </w:p>
         </w:tc>
@@ -1156,12 +1160,6 @@
         </w:tc>
       </w:tr>
       <w:tr>
-        <w:tblPrEx>
-          <w:tblCellMar>
-            <w:top w:w="0" w:type="dxa"/>
-            <w:bottom w:w="0" w:type="dxa"/>
-          </w:tblCellMar>
-        </w:tblPrEx>
         <w:trPr>
           <w:cantSplit/>
         </w:trPr>
@@ -1259,7 +1257,15 @@
                 <w:sz w:val="24"/>
                 <w:szCs w:val="24"/>
               </w:rPr>
-              <w:t>₡900</w:t>
+              <w:t>₡</w:t>
+            </w:r>
+            <w:r>
+              <w:rPr>
+                <w:rFonts w:ascii="Times New Roman" w:hAnsi="Times New Roman" w:cs="Times New Roman"/>
+                <w:sz w:val="24"/>
+                <w:szCs w:val="24"/>
+              </w:rPr>
+              <w:t>900</w:t>
             </w:r>
           </w:p>
         </w:tc>
@@ -1295,7 +1301,15 @@
                 <w:sz w:val="24"/>
                 <w:szCs w:val="24"/>
               </w:rPr>
-              <w:t>₡7 000</w:t>
+              <w:t>₡</w:t>
+            </w:r>
+            <w:r>
+              <w:rPr>
+                <w:rFonts w:ascii="Times New Roman" w:hAnsi="Times New Roman" w:cs="Times New Roman"/>
+                <w:sz w:val="24"/>
+                <w:szCs w:val="24"/>
+              </w:rPr>
+              <w:t>7 000</w:t>
             </w:r>
           </w:p>
         </w:tc>
@@ -1337,12 +1351,6 @@
         </w:tc>
       </w:tr>
       <w:tr>
-        <w:tblPrEx>
-          <w:tblCellMar>
-            <w:top w:w="0" w:type="dxa"/>
-            <w:bottom w:w="0" w:type="dxa"/>
-          </w:tblCellMar>
-        </w:tblPrEx>
         <w:trPr>
           <w:cantSplit/>
         </w:trPr>
@@ -1442,7 +1450,15 @@
                 <w:sz w:val="24"/>
                 <w:szCs w:val="24"/>
               </w:rPr>
-              <w:t>₡1 500</w:t>
+              <w:t>₡</w:t>
+            </w:r>
+            <w:r>
+              <w:rPr>
+                <w:rFonts w:ascii="Times New Roman" w:hAnsi="Times New Roman" w:cs="Times New Roman"/>
+                <w:sz w:val="24"/>
+                <w:szCs w:val="24"/>
+              </w:rPr>
+              <w:t>1 500</w:t>
             </w:r>
           </w:p>
         </w:tc>
@@ -1478,7 +1494,15 @@
                 <w:sz w:val="24"/>
                 <w:szCs w:val="24"/>
               </w:rPr>
-              <w:t>₡11 000</w:t>
+              <w:t>₡</w:t>
+            </w:r>
+            <w:r>
+              <w:rPr>
+                <w:rFonts w:ascii="Times New Roman" w:hAnsi="Times New Roman" w:cs="Times New Roman"/>
+                <w:sz w:val="24"/>
+                <w:szCs w:val="24"/>
+              </w:rPr>
+              <w:t>11 000</w:t>
             </w:r>
           </w:p>
         </w:tc>
@@ -1593,12 +1617,6 @@
         <w:gridCol w:w="5680"/>
       </w:tblGrid>
       <w:tr>
-        <w:tblPrEx>
-          <w:tblCellMar>
-            <w:top w:w="0" w:type="dxa"/>
-            <w:bottom w:w="0" w:type="dxa"/>
-          </w:tblCellMar>
-        </w:tblPrEx>
         <w:trPr>
           <w:cantSplit/>
           <w:tblHeader/>
@@ -1685,12 +1703,6 @@
         </w:tc>
       </w:tr>
       <w:tr>
-        <w:tblPrEx>
-          <w:tblCellMar>
-            <w:top w:w="0" w:type="dxa"/>
-            <w:bottom w:w="0" w:type="dxa"/>
-          </w:tblCellMar>
-        </w:tblPrEx>
         <w:trPr>
           <w:cantSplit/>
         </w:trPr>
@@ -1867,12 +1879,6 @@
         </w:tc>
       </w:tr>
       <w:tr>
-        <w:tblPrEx>
-          <w:tblCellMar>
-            <w:top w:w="0" w:type="dxa"/>
-            <w:bottom w:w="0" w:type="dxa"/>
-          </w:tblCellMar>
-        </w:tblPrEx>
         <w:trPr>
           <w:cantSplit/>
         </w:trPr>
@@ -2037,12 +2043,6 @@
         </w:tc>
       </w:tr>
       <w:tr>
-        <w:tblPrEx>
-          <w:tblCellMar>
-            <w:top w:w="0" w:type="dxa"/>
-            <w:bottom w:w="0" w:type="dxa"/>
-          </w:tblCellMar>
-        </w:tblPrEx>
         <w:trPr>
           <w:cantSplit/>
         </w:trPr>
@@ -2184,12 +2184,6 @@
         </w:tc>
       </w:tr>
       <w:tr>
-        <w:tblPrEx>
-          <w:tblCellMar>
-            <w:top w:w="0" w:type="dxa"/>
-            <w:bottom w:w="0" w:type="dxa"/>
-          </w:tblCellMar>
-        </w:tblPrEx>
         <w:trPr>
           <w:cantSplit/>
         </w:trPr>
@@ -2327,12 +2321,6 @@
         </w:tc>
       </w:tr>
       <w:tr>
-        <w:tblPrEx>
-          <w:tblCellMar>
-            <w:top w:w="0" w:type="dxa"/>
-            <w:bottom w:w="0" w:type="dxa"/>
-          </w:tblCellMar>
-        </w:tblPrEx>
         <w:trPr>
           <w:cantSplit/>
         </w:trPr>
@@ -2450,12 +2438,6 @@
         </w:tc>
       </w:tr>
       <w:tr>
-        <w:tblPrEx>
-          <w:tblCellMar>
-            <w:top w:w="0" w:type="dxa"/>
-            <w:bottom w:w="0" w:type="dxa"/>
-          </w:tblCellMar>
-        </w:tblPrEx>
         <w:trPr>
           <w:cantSplit/>
         </w:trPr>
@@ -2568,12 +2550,6 @@
         </w:tc>
       </w:tr>
       <w:tr>
-        <w:tblPrEx>
-          <w:tblCellMar>
-            <w:top w:w="0" w:type="dxa"/>
-            <w:bottom w:w="0" w:type="dxa"/>
-          </w:tblCellMar>
-        </w:tblPrEx>
         <w:trPr>
           <w:cantSplit/>
         </w:trPr>
@@ -2697,12 +2673,6 @@
         </w:tc>
       </w:tr>
       <w:tr>
-        <w:tblPrEx>
-          <w:tblCellMar>
-            <w:top w:w="0" w:type="dxa"/>
-            <w:bottom w:w="0" w:type="dxa"/>
-          </w:tblCellMar>
-        </w:tblPrEx>
         <w:trPr>
           <w:cantSplit/>
         </w:trPr>
@@ -3985,12 +3955,6 @@
         <w:gridCol w:w="2822"/>
       </w:tblGrid>
       <w:tr>
-        <w:tblPrEx>
-          <w:tblCellMar>
-            <w:top w:w="0" w:type="dxa"/>
-            <w:bottom w:w="0" w:type="dxa"/>
-          </w:tblCellMar>
-        </w:tblPrEx>
         <w:trPr>
           <w:cantSplit/>
           <w:tblHeader/>
@@ -4147,12 +4111,6 @@
         </w:tc>
       </w:tr>
       <w:tr>
-        <w:tblPrEx>
-          <w:tblCellMar>
-            <w:top w:w="0" w:type="dxa"/>
-            <w:bottom w:w="0" w:type="dxa"/>
-          </w:tblCellMar>
-        </w:tblPrEx>
         <w:trPr>
           <w:cantSplit/>
         </w:trPr>
@@ -4308,12 +4266,6 @@
         </w:tc>
       </w:tr>
       <w:tr>
-        <w:tblPrEx>
-          <w:tblCellMar>
-            <w:top w:w="0" w:type="dxa"/>
-            <w:bottom w:w="0" w:type="dxa"/>
-          </w:tblCellMar>
-        </w:tblPrEx>
         <w:trPr>
           <w:cantSplit/>
         </w:trPr>
@@ -4433,12 +4385,6 @@
         </w:tc>
       </w:tr>
       <w:tr>
-        <w:tblPrEx>
-          <w:tblCellMar>
-            <w:top w:w="0" w:type="dxa"/>
-            <w:bottom w:w="0" w:type="dxa"/>
-          </w:tblCellMar>
-        </w:tblPrEx>
         <w:trPr>
           <w:cantSplit/>
         </w:trPr>
@@ -4574,12 +4520,6 @@
         </w:tc>
       </w:tr>
       <w:tr>
-        <w:tblPrEx>
-          <w:tblCellMar>
-            <w:top w:w="0" w:type="dxa"/>
-            <w:bottom w:w="0" w:type="dxa"/>
-          </w:tblCellMar>
-        </w:tblPrEx>
         <w:trPr>
           <w:cantSplit/>
         </w:trPr>
@@ -4719,12 +4659,6 @@
         </w:tc>
       </w:tr>
       <w:tr>
-        <w:tblPrEx>
-          <w:tblCellMar>
-            <w:top w:w="0" w:type="dxa"/>
-            <w:bottom w:w="0" w:type="dxa"/>
-          </w:tblCellMar>
-        </w:tblPrEx>
         <w:trPr>
           <w:cantSplit/>
         </w:trPr>
@@ -4873,12 +4807,6 @@
         </w:tc>
       </w:tr>
       <w:tr>
-        <w:tblPrEx>
-          <w:tblCellMar>
-            <w:top w:w="0" w:type="dxa"/>
-            <w:bottom w:w="0" w:type="dxa"/>
-          </w:tblCellMar>
-        </w:tblPrEx>
         <w:trPr>
           <w:cantSplit/>
         </w:trPr>
@@ -8101,12 +8029,6 @@
         <w:gridCol w:w="4080"/>
       </w:tblGrid>
       <w:tr>
-        <w:tblPrEx>
-          <w:tblCellMar>
-            <w:top w:w="0" w:type="dxa"/>
-            <w:bottom w:w="0" w:type="dxa"/>
-          </w:tblCellMar>
-        </w:tblPrEx>
         <w:trPr>
           <w:cantSplit/>
           <w:tblHeader/>
@@ -8273,12 +8195,6 @@
         </w:tc>
       </w:tr>
       <w:tr>
-        <w:tblPrEx>
-          <w:tblCellMar>
-            <w:top w:w="0" w:type="dxa"/>
-            <w:bottom w:w="0" w:type="dxa"/>
-          </w:tblCellMar>
-        </w:tblPrEx>
         <w:trPr>
           <w:cantSplit/>
         </w:trPr>
@@ -8386,18 +8302,20 @@
                 <w:sz w:val="24"/>
                 <w:szCs w:val="24"/>
               </w:rPr>
-              <w:t>₡900</w:t>
+              <w:t>₡</w:t>
+            </w:r>
+            <w:r>
+              <w:rPr>
+                <w:rFonts w:ascii="Times New Roman" w:hAnsi="Times New Roman" w:cs="Times New Roman"/>
+                <w:sz w:val="24"/>
+                <w:szCs w:val="24"/>
+              </w:rPr>
+              <w:t>900</w:t>
             </w:r>
           </w:p>
         </w:tc>
       </w:tr>
       <w:tr>
-        <w:tblPrEx>
-          <w:tblCellMar>
-            <w:top w:w="0" w:type="dxa"/>
-            <w:bottom w:w="0" w:type="dxa"/>
-          </w:tblCellMar>
-        </w:tblPrEx>
         <w:trPr>
           <w:cantSplit/>
         </w:trPr>
@@ -8505,18 +8423,20 @@
                 <w:sz w:val="24"/>
                 <w:szCs w:val="24"/>
               </w:rPr>
-              <w:t>₡1 800</w:t>
+              <w:t>₡</w:t>
+            </w:r>
+            <w:r>
+              <w:rPr>
+                <w:rFonts w:ascii="Times New Roman" w:hAnsi="Times New Roman" w:cs="Times New Roman"/>
+                <w:sz w:val="24"/>
+                <w:szCs w:val="24"/>
+              </w:rPr>
+              <w:t>1 800</w:t>
             </w:r>
           </w:p>
         </w:tc>
       </w:tr>
       <w:tr>
-        <w:tblPrEx>
-          <w:tblCellMar>
-            <w:top w:w="0" w:type="dxa"/>
-            <w:bottom w:w="0" w:type="dxa"/>
-          </w:tblCellMar>
-        </w:tblPrEx>
         <w:trPr>
           <w:cantSplit/>
         </w:trPr>
@@ -8626,18 +8546,21 @@
                 <w:szCs w:val="24"/>
                 <w:lang w:val="es-CR"/>
               </w:rPr>
-              <w:t>₡8 100 (aún no aplica el tope)</w:t>
+              <w:t>₡</w:t>
+            </w:r>
+            <w:r>
+              <w:rPr>
+                <w:rFonts w:ascii="Times New Roman" w:hAnsi="Times New Roman" w:cs="Times New Roman"/>
+                <w:sz w:val="24"/>
+                <w:szCs w:val="24"/>
+                <w:lang w:val="es-CR"/>
+              </w:rPr>
+              <w:t>8 100 (aún no aplica el tope)</w:t>
             </w:r>
           </w:p>
         </w:tc>
       </w:tr>
       <w:tr>
-        <w:tblPrEx>
-          <w:tblCellMar>
-            <w:top w:w="0" w:type="dxa"/>
-            <w:bottom w:w="0" w:type="dxa"/>
-          </w:tblCellMar>
-        </w:tblPrEx>
         <w:trPr>
           <w:cantSplit/>
         </w:trPr>
@@ -8745,7 +8668,15 @@
                 <w:sz w:val="24"/>
                 <w:szCs w:val="24"/>
               </w:rPr>
-              <w:t xml:space="preserve">₡7 000 (tope </w:t>
+              <w:t>₡</w:t>
+            </w:r>
+            <w:r>
+              <w:rPr>
+                <w:rFonts w:ascii="Times New Roman" w:hAnsi="Times New Roman" w:cs="Times New Roman"/>
+                <w:sz w:val="24"/>
+                <w:szCs w:val="24"/>
+              </w:rPr>
+              <w:t xml:space="preserve">7 000 (tope </w:t>
             </w:r>
             <w:proofErr w:type="spellStart"/>
             <w:r>
@@ -8769,12 +8700,6 @@
         </w:tc>
       </w:tr>
       <w:tr>
-        <w:tblPrEx>
-          <w:tblCellMar>
-            <w:top w:w="0" w:type="dxa"/>
-            <w:bottom w:w="0" w:type="dxa"/>
-          </w:tblCellMar>
-        </w:tblPrEx>
         <w:trPr>
           <w:cantSplit/>
         </w:trPr>
@@ -8882,7 +8807,15 @@
                 <w:sz w:val="24"/>
                 <w:szCs w:val="24"/>
               </w:rPr>
-              <w:t>₡7 000 / ₡7 900 / ₡14 000</w:t>
+              <w:t>₡</w:t>
+            </w:r>
+            <w:r>
+              <w:rPr>
+                <w:rFonts w:ascii="Times New Roman" w:hAnsi="Times New Roman" w:cs="Times New Roman"/>
+                <w:sz w:val="24"/>
+                <w:szCs w:val="24"/>
+              </w:rPr>
+              <w:t>7 000 / ₡7 900 / ₡14 000</w:t>
             </w:r>
           </w:p>
         </w:tc>
@@ -9006,12 +8939,6 @@
         <w:gridCol w:w="2313"/>
       </w:tblGrid>
       <w:tr>
-        <w:tblPrEx>
-          <w:tblCellMar>
-            <w:top w:w="0" w:type="dxa"/>
-            <w:bottom w:w="0" w:type="dxa"/>
-          </w:tblCellMar>
-        </w:tblPrEx>
         <w:trPr>
           <w:cantSplit/>
           <w:tblHeader/>
@@ -9198,12 +9125,6 @@
         </w:tc>
       </w:tr>
       <w:tr>
-        <w:tblPrEx>
-          <w:tblCellMar>
-            <w:top w:w="0" w:type="dxa"/>
-            <w:bottom w:w="0" w:type="dxa"/>
-          </w:tblCellMar>
-        </w:tblPrEx>
         <w:trPr>
           <w:cantSplit/>
         </w:trPr>
@@ -9389,12 +9310,6 @@
         </w:tc>
       </w:tr>
       <w:tr>
-        <w:tblPrEx>
-          <w:tblCellMar>
-            <w:top w:w="0" w:type="dxa"/>
-            <w:bottom w:w="0" w:type="dxa"/>
-          </w:tblCellMar>
-        </w:tblPrEx>
         <w:trPr>
           <w:cantSplit/>
         </w:trPr>
@@ -9561,12 +9476,6 @@
         </w:tc>
       </w:tr>
       <w:tr>
-        <w:tblPrEx>
-          <w:tblCellMar>
-            <w:top w:w="0" w:type="dxa"/>
-            <w:bottom w:w="0" w:type="dxa"/>
-          </w:tblCellMar>
-        </w:tblPrEx>
         <w:trPr>
           <w:cantSplit/>
         </w:trPr>
@@ -9732,12 +9641,6 @@
         </w:tc>
       </w:tr>
       <w:tr>
-        <w:tblPrEx>
-          <w:tblCellMar>
-            <w:top w:w="0" w:type="dxa"/>
-            <w:bottom w:w="0" w:type="dxa"/>
-          </w:tblCellMar>
-        </w:tblPrEx>
         <w:trPr>
           <w:cantSplit/>
         </w:trPr>
@@ -9919,12 +9822,6 @@
         </w:tc>
       </w:tr>
       <w:tr>
-        <w:tblPrEx>
-          <w:tblCellMar>
-            <w:top w:w="0" w:type="dxa"/>
-            <w:bottom w:w="0" w:type="dxa"/>
-          </w:tblCellMar>
-        </w:tblPrEx>
         <w:trPr>
           <w:cantSplit/>
         </w:trPr>
@@ -10110,12 +10007,6 @@
         </w:tc>
       </w:tr>
       <w:tr>
-        <w:tblPrEx>
-          <w:tblCellMar>
-            <w:top w:w="0" w:type="dxa"/>
-            <w:bottom w:w="0" w:type="dxa"/>
-          </w:tblCellMar>
-        </w:tblPrEx>
         <w:trPr>
           <w:cantSplit/>
         </w:trPr>
@@ -10319,12 +10210,6 @@
         </w:tc>
       </w:tr>
       <w:tr>
-        <w:tblPrEx>
-          <w:tblCellMar>
-            <w:top w:w="0" w:type="dxa"/>
-            <w:bottom w:w="0" w:type="dxa"/>
-          </w:tblCellMar>
-        </w:tblPrEx>
         <w:trPr>
           <w:cantSplit/>
         </w:trPr>
@@ -10514,12 +10399,6 @@
         </w:tc>
       </w:tr>
       <w:tr>
-        <w:tblPrEx>
-          <w:tblCellMar>
-            <w:top w:w="0" w:type="dxa"/>
-            <w:bottom w:w="0" w:type="dxa"/>
-          </w:tblCellMar>
-        </w:tblPrEx>
         <w:trPr>
           <w:cantSplit/>
         </w:trPr>
@@ -10932,12 +10811,6 @@
         <w:gridCol w:w="614"/>
       </w:tblGrid>
       <w:tr>
-        <w:tblPrEx>
-          <w:tblCellMar>
-            <w:top w:w="0" w:type="dxa"/>
-            <w:bottom w:w="0" w:type="dxa"/>
-          </w:tblCellMar>
-        </w:tblPrEx>
         <w:trPr>
           <w:cantSplit/>
           <w:tblHeader/>
@@ -11176,12 +11049,6 @@
         </w:tc>
       </w:tr>
       <w:tr>
-        <w:tblPrEx>
-          <w:tblCellMar>
-            <w:top w:w="0" w:type="dxa"/>
-            <w:bottom w:w="0" w:type="dxa"/>
-          </w:tblCellMar>
-        </w:tblPrEx>
         <w:trPr>
           <w:cantSplit/>
         </w:trPr>
@@ -11433,12 +11300,6 @@
         </w:tc>
       </w:tr>
       <w:tr>
-        <w:tblPrEx>
-          <w:tblCellMar>
-            <w:top w:w="0" w:type="dxa"/>
-            <w:bottom w:w="0" w:type="dxa"/>
-          </w:tblCellMar>
-        </w:tblPrEx>
         <w:trPr>
           <w:cantSplit/>
         </w:trPr>
@@ -11691,12 +11552,6 @@
         </w:tc>
       </w:tr>
       <w:tr>
-        <w:tblPrEx>
-          <w:tblCellMar>
-            <w:top w:w="0" w:type="dxa"/>
-            <w:bottom w:w="0" w:type="dxa"/>
-          </w:tblCellMar>
-        </w:tblPrEx>
         <w:trPr>
           <w:cantSplit/>
         </w:trPr>
@@ -11930,12 +11785,6 @@
         </w:tc>
       </w:tr>
       <w:tr>
-        <w:tblPrEx>
-          <w:tblCellMar>
-            <w:top w:w="0" w:type="dxa"/>
-            <w:bottom w:w="0" w:type="dxa"/>
-          </w:tblCellMar>
-        </w:tblPrEx>
         <w:trPr>
           <w:cantSplit/>
         </w:trPr>
@@ -12181,12 +12030,6 @@
         </w:tc>
       </w:tr>
       <w:tr>
-        <w:tblPrEx>
-          <w:tblCellMar>
-            <w:top w:w="0" w:type="dxa"/>
-            <w:bottom w:w="0" w:type="dxa"/>
-          </w:tblCellMar>
-        </w:tblPrEx>
         <w:trPr>
           <w:cantSplit/>
         </w:trPr>
@@ -12432,12 +12275,6 @@
         </w:tc>
       </w:tr>
       <w:tr>
-        <w:tblPrEx>
-          <w:tblCellMar>
-            <w:top w:w="0" w:type="dxa"/>
-            <w:bottom w:w="0" w:type="dxa"/>
-          </w:tblCellMar>
-        </w:tblPrEx>
         <w:trPr>
           <w:cantSplit/>
         </w:trPr>
@@ -12707,12 +12544,6 @@
         </w:tc>
       </w:tr>
       <w:tr>
-        <w:tblPrEx>
-          <w:tblCellMar>
-            <w:top w:w="0" w:type="dxa"/>
-            <w:bottom w:w="0" w:type="dxa"/>
-          </w:tblCellMar>
-        </w:tblPrEx>
         <w:trPr>
           <w:cantSplit/>
         </w:trPr>
@@ -12992,12 +12823,6 @@
         </w:tc>
       </w:tr>
       <w:tr>
-        <w:tblPrEx>
-          <w:tblCellMar>
-            <w:top w:w="0" w:type="dxa"/>
-            <w:bottom w:w="0" w:type="dxa"/>
-          </w:tblCellMar>
-        </w:tblPrEx>
         <w:trPr>
           <w:cantSplit/>
         </w:trPr>
@@ -13161,7 +12986,15 @@
                 <w:sz w:val="24"/>
                 <w:szCs w:val="24"/>
               </w:rPr>
-              <w:t>₡900</w:t>
+              <w:t>₡</w:t>
+            </w:r>
+            <w:r>
+              <w:rPr>
+                <w:rFonts w:ascii="Times New Roman" w:hAnsi="Times New Roman" w:cs="Times New Roman"/>
+                <w:sz w:val="24"/>
+                <w:szCs w:val="24"/>
+              </w:rPr>
+              <w:t>900</w:t>
             </w:r>
           </w:p>
         </w:tc>
@@ -13239,12 +13072,6 @@
         </w:tc>
       </w:tr>
       <w:tr>
-        <w:tblPrEx>
-          <w:tblCellMar>
-            <w:top w:w="0" w:type="dxa"/>
-            <w:bottom w:w="0" w:type="dxa"/>
-          </w:tblCellMar>
-        </w:tblPrEx>
         <w:trPr>
           <w:cantSplit/>
         </w:trPr>
@@ -13408,7 +13235,15 @@
                 <w:sz w:val="24"/>
                 <w:szCs w:val="24"/>
               </w:rPr>
-              <w:t>₡900</w:t>
+              <w:t>₡</w:t>
+            </w:r>
+            <w:r>
+              <w:rPr>
+                <w:rFonts w:ascii="Times New Roman" w:hAnsi="Times New Roman" w:cs="Times New Roman"/>
+                <w:sz w:val="24"/>
+                <w:szCs w:val="24"/>
+              </w:rPr>
+              <w:t>900</w:t>
             </w:r>
           </w:p>
         </w:tc>
@@ -13486,12 +13321,6 @@
         </w:tc>
       </w:tr>
       <w:tr>
-        <w:tblPrEx>
-          <w:tblCellMar>
-            <w:top w:w="0" w:type="dxa"/>
-            <w:bottom w:w="0" w:type="dxa"/>
-          </w:tblCellMar>
-        </w:tblPrEx>
         <w:trPr>
           <w:cantSplit/>
         </w:trPr>
@@ -13655,7 +13484,15 @@
                 <w:sz w:val="24"/>
                 <w:szCs w:val="24"/>
               </w:rPr>
-              <w:t>₡1 800</w:t>
+              <w:t>₡</w:t>
+            </w:r>
+            <w:r>
+              <w:rPr>
+                <w:rFonts w:ascii="Times New Roman" w:hAnsi="Times New Roman" w:cs="Times New Roman"/>
+                <w:sz w:val="24"/>
+                <w:szCs w:val="24"/>
+              </w:rPr>
+              <w:t>1 800</w:t>
             </w:r>
           </w:p>
         </w:tc>
@@ -13733,12 +13570,6 @@
         </w:tc>
       </w:tr>
       <w:tr>
-        <w:tblPrEx>
-          <w:tblCellMar>
-            <w:top w:w="0" w:type="dxa"/>
-            <w:bottom w:w="0" w:type="dxa"/>
-          </w:tblCellMar>
-        </w:tblPrEx>
         <w:trPr>
           <w:cantSplit/>
         </w:trPr>
@@ -13884,7 +13715,15 @@
                 <w:sz w:val="24"/>
                 <w:szCs w:val="24"/>
               </w:rPr>
-              <w:t>₡11 000</w:t>
+              <w:t>₡</w:t>
+            </w:r>
+            <w:r>
+              <w:rPr>
+                <w:rFonts w:ascii="Times New Roman" w:hAnsi="Times New Roman" w:cs="Times New Roman"/>
+                <w:sz w:val="24"/>
+                <w:szCs w:val="24"/>
+              </w:rPr>
+              <w:t>11 000</w:t>
             </w:r>
           </w:p>
         </w:tc>
@@ -13962,12 +13801,6 @@
         </w:tc>
       </w:tr>
       <w:tr>
-        <w:tblPrEx>
-          <w:tblCellMar>
-            <w:top w:w="0" w:type="dxa"/>
-            <w:bottom w:w="0" w:type="dxa"/>
-          </w:tblCellMar>
-        </w:tblPrEx>
         <w:trPr>
           <w:cantSplit/>
         </w:trPr>
@@ -14191,12 +14024,6 @@
         </w:tc>
       </w:tr>
       <w:tr>
-        <w:tblPrEx>
-          <w:tblCellMar>
-            <w:top w:w="0" w:type="dxa"/>
-            <w:bottom w:w="0" w:type="dxa"/>
-          </w:tblCellMar>
-        </w:tblPrEx>
         <w:trPr>
           <w:cantSplit/>
         </w:trPr>
@@ -14342,7 +14169,15 @@
                 <w:sz w:val="24"/>
                 <w:szCs w:val="24"/>
               </w:rPr>
-              <w:t>₡2 700 (3 h × ₡900)</w:t>
+              <w:t>₡</w:t>
+            </w:r>
+            <w:r>
+              <w:rPr>
+                <w:rFonts w:ascii="Times New Roman" w:hAnsi="Times New Roman" w:cs="Times New Roman"/>
+                <w:sz w:val="24"/>
+                <w:szCs w:val="24"/>
+              </w:rPr>
+              <w:t>2 700 (3 h × ₡900)</w:t>
             </w:r>
           </w:p>
         </w:tc>
@@ -14420,12 +14255,6 @@
         </w:tc>
       </w:tr>
       <w:tr>
-        <w:tblPrEx>
-          <w:tblCellMar>
-            <w:top w:w="0" w:type="dxa"/>
-            <w:bottom w:w="0" w:type="dxa"/>
-          </w:tblCellMar>
-        </w:tblPrEx>
         <w:trPr>
           <w:cantSplit/>
         </w:trPr>
@@ -14669,12 +14498,6 @@
         </w:tc>
       </w:tr>
       <w:tr>
-        <w:tblPrEx>
-          <w:tblCellMar>
-            <w:top w:w="0" w:type="dxa"/>
-            <w:bottom w:w="0" w:type="dxa"/>
-          </w:tblCellMar>
-        </w:tblPrEx>
         <w:trPr>
           <w:cantSplit/>
         </w:trPr>
@@ -14838,7 +14661,15 @@
                 <w:sz w:val="24"/>
                 <w:szCs w:val="24"/>
               </w:rPr>
-              <w:t>₡13 700</w:t>
+              <w:t>₡</w:t>
+            </w:r>
+            <w:r>
+              <w:rPr>
+                <w:rFonts w:ascii="Times New Roman" w:hAnsi="Times New Roman" w:cs="Times New Roman"/>
+                <w:sz w:val="24"/>
+                <w:szCs w:val="24"/>
+              </w:rPr>
+              <w:t>13 700</w:t>
             </w:r>
           </w:p>
         </w:tc>
@@ -14916,12 +14747,6 @@
         </w:tc>
       </w:tr>
       <w:tr>
-        <w:tblPrEx>
-          <w:tblCellMar>
-            <w:top w:w="0" w:type="dxa"/>
-            <w:bottom w:w="0" w:type="dxa"/>
-          </w:tblCellMar>
-        </w:tblPrEx>
         <w:trPr>
           <w:cantSplit/>
         </w:trPr>
@@ -15195,12 +15020,6 @@
         </w:tc>
       </w:tr>
       <w:tr>
-        <w:tblPrEx>
-          <w:tblCellMar>
-            <w:top w:w="0" w:type="dxa"/>
-            <w:bottom w:w="0" w:type="dxa"/>
-          </w:tblCellMar>
-        </w:tblPrEx>
         <w:trPr>
           <w:cantSplit/>
         </w:trPr>
@@ -16096,27 +15915,370 @@
           <w:color w:val="auto"/>
           <w:lang w:val="es-CR"/>
         </w:rPr>
-        <w:t>[Nombre completo del integrante 2]</w:t>
+        <w:t>Alen Cedeño Miranda</w:t>
       </w:r>
     </w:p>
     <w:p>
       <w:pPr>
-        <w:spacing w:after="100"/>
-        <w:rPr>
-          <w:rFonts w:ascii="Times New Roman" w:hAnsi="Times New Roman" w:cs="Times New Roman"/>
-          <w:sz w:val="24"/>
-          <w:szCs w:val="24"/>
+        <w:pStyle w:val="Ttulo2"/>
+        <w:keepNext/>
+        <w:rPr>
+          <w:rFonts w:ascii="Times New Roman" w:hAnsi="Times New Roman" w:cs="Times New Roman"/>
+          <w:b w:val="0"/>
+          <w:bCs w:val="0"/>
+          <w:color w:val="auto"/>
           <w:lang w:val="es-CR"/>
         </w:rPr>
       </w:pPr>
       <w:r>
         <w:rPr>
           <w:rFonts w:ascii="Times New Roman" w:hAnsi="Times New Roman" w:cs="Times New Roman"/>
-          <w:sz w:val="24"/>
-          <w:szCs w:val="24"/>
-          <w:lang w:val="es-CR"/>
-        </w:rPr>
-        <w:t>[Escribir aquí la conclusión individual, mínimo 200 palabras.]</w:t>
+          <w:b w:val="0"/>
+          <w:bCs w:val="0"/>
+          <w:color w:val="auto"/>
+          <w:lang w:val="es-CR"/>
+        </w:rPr>
+        <w:t xml:space="preserve">Creo que una de las partes más difíciles de decidir fue el diseño del diagrama UML, ya que es la base de todo el proyecto: una buena o una mala decisión en ese momento repercute en todo el desarrollo. Por ejemplo, tuvimos que definir dónde ubicar la tarifa máxima diaria, y decidimos que no estuviera en el parqueo ni en la clase principal, sino en un solo lugar, la clase </w:t>
+      </w:r>
+      <w:proofErr w:type="spellStart"/>
+      <w:r>
+        <w:rPr>
+          <w:rFonts w:ascii="Times New Roman" w:hAnsi="Times New Roman" w:cs="Times New Roman"/>
+          <w:b w:val="0"/>
+          <w:bCs w:val="0"/>
+          <w:color w:val="auto"/>
+          <w:lang w:val="es-CR"/>
+        </w:rPr>
+        <w:t>HourlyPricingPolicy</w:t>
+      </w:r>
+      <w:proofErr w:type="spellEnd"/>
+      <w:r>
+        <w:rPr>
+          <w:rFonts w:ascii="Times New Roman" w:hAnsi="Times New Roman" w:cs="Times New Roman"/>
+          <w:b w:val="0"/>
+          <w:bCs w:val="0"/>
+          <w:color w:val="auto"/>
+          <w:lang w:val="es-CR"/>
+        </w:rPr>
+        <w:t>.</w:t>
+      </w:r>
+    </w:p>
+    <w:p>
+      <w:pPr>
+        <w:pStyle w:val="Ttulo2"/>
+        <w:keepNext/>
+        <w:rPr>
+          <w:rFonts w:ascii="Times New Roman" w:hAnsi="Times New Roman" w:cs="Times New Roman"/>
+          <w:b w:val="0"/>
+          <w:bCs w:val="0"/>
+          <w:color w:val="auto"/>
+          <w:lang w:val="es-CR"/>
+        </w:rPr>
+      </w:pPr>
+      <w:r>
+        <w:rPr>
+          <w:rFonts w:ascii="Times New Roman" w:hAnsi="Times New Roman" w:cs="Times New Roman"/>
+          <w:b w:val="0"/>
+          <w:bCs w:val="0"/>
+          <w:color w:val="auto"/>
+          <w:lang w:val="es-CR"/>
+        </w:rPr>
+        <w:t xml:space="preserve">La ventaja más clara que vi en el polimorfismo y en el patrón Estrategia, frente a un switch por tipo, es </w:t>
+      </w:r>
+      <w:proofErr w:type="gramStart"/>
+      <w:r>
+        <w:rPr>
+          <w:rFonts w:ascii="Times New Roman" w:hAnsi="Times New Roman" w:cs="Times New Roman"/>
+          <w:b w:val="0"/>
+          <w:bCs w:val="0"/>
+          <w:color w:val="auto"/>
+          <w:lang w:val="es-CR"/>
+        </w:rPr>
+        <w:t>que</w:t>
+      </w:r>
+      <w:proofErr w:type="gramEnd"/>
+      <w:r>
+        <w:rPr>
+          <w:rFonts w:ascii="Times New Roman" w:hAnsi="Times New Roman" w:cs="Times New Roman"/>
+          <w:b w:val="0"/>
+          <w:bCs w:val="0"/>
+          <w:color w:val="auto"/>
+          <w:lang w:val="es-CR"/>
+        </w:rPr>
+        <w:t xml:space="preserve"> si se agrega un nuevo tipo de vehículo o una nueva forma de cobro, </w:t>
+      </w:r>
+      <w:r>
+        <w:rPr>
+          <w:rFonts w:ascii="Times New Roman" w:hAnsi="Times New Roman" w:cs="Times New Roman"/>
+          <w:b w:val="0"/>
+          <w:bCs w:val="0"/>
+          <w:color w:val="auto"/>
+          <w:lang w:val="es-CR"/>
+        </w:rPr>
+        <w:t>solo se tiene que</w:t>
+      </w:r>
+      <w:r>
+        <w:rPr>
+          <w:rFonts w:ascii="Times New Roman" w:hAnsi="Times New Roman" w:cs="Times New Roman"/>
+          <w:b w:val="0"/>
+          <w:bCs w:val="0"/>
+          <w:color w:val="auto"/>
+          <w:lang w:val="es-CR"/>
+        </w:rPr>
+        <w:t xml:space="preserve"> crear una clase nueva sin modificar las que ya funcionan. Con un switch habría que buscar y cambiar cada condición, con el riesgo de olvidar alguna y provocar errores.</w:t>
+      </w:r>
+    </w:p>
+    <w:p>
+      <w:pPr>
+        <w:pStyle w:val="Ttulo2"/>
+        <w:keepNext/>
+        <w:rPr>
+          <w:rFonts w:ascii="Times New Roman" w:hAnsi="Times New Roman" w:cs="Times New Roman"/>
+          <w:b w:val="0"/>
+          <w:bCs w:val="0"/>
+          <w:color w:val="auto"/>
+          <w:lang w:val="es-CR"/>
+        </w:rPr>
+      </w:pPr>
+      <w:r>
+        <w:rPr>
+          <w:rFonts w:ascii="Times New Roman" w:hAnsi="Times New Roman" w:cs="Times New Roman"/>
+          <w:b w:val="0"/>
+          <w:bCs w:val="0"/>
+          <w:color w:val="auto"/>
+          <w:lang w:val="es-CR"/>
+        </w:rPr>
+        <w:t xml:space="preserve">Con un poco </w:t>
+      </w:r>
+      <w:proofErr w:type="spellStart"/>
+      <w:r>
+        <w:rPr>
+          <w:rFonts w:ascii="Times New Roman" w:hAnsi="Times New Roman" w:cs="Times New Roman"/>
+          <w:b w:val="0"/>
+          <w:bCs w:val="0"/>
+          <w:color w:val="auto"/>
+          <w:lang w:val="es-CR"/>
+        </w:rPr>
+        <w:t>mas</w:t>
+      </w:r>
+      <w:proofErr w:type="spellEnd"/>
+      <w:r>
+        <w:rPr>
+          <w:rFonts w:ascii="Times New Roman" w:hAnsi="Times New Roman" w:cs="Times New Roman"/>
+          <w:b w:val="0"/>
+          <w:bCs w:val="0"/>
+          <w:color w:val="auto"/>
+          <w:lang w:val="es-CR"/>
+        </w:rPr>
+        <w:t xml:space="preserve"> de tiempo intentaría armar una interfaz un poco </w:t>
+      </w:r>
+      <w:proofErr w:type="spellStart"/>
+      <w:r>
+        <w:rPr>
+          <w:rFonts w:ascii="Times New Roman" w:hAnsi="Times New Roman" w:cs="Times New Roman"/>
+          <w:b w:val="0"/>
+          <w:bCs w:val="0"/>
+          <w:color w:val="auto"/>
+          <w:lang w:val="es-CR"/>
+        </w:rPr>
+        <w:t>mas</w:t>
+      </w:r>
+      <w:proofErr w:type="spellEnd"/>
+      <w:r>
+        <w:rPr>
+          <w:rFonts w:ascii="Times New Roman" w:hAnsi="Times New Roman" w:cs="Times New Roman"/>
+          <w:b w:val="0"/>
+          <w:bCs w:val="0"/>
+          <w:color w:val="auto"/>
+          <w:lang w:val="es-CR"/>
+        </w:rPr>
+        <w:t xml:space="preserve"> intuitiva par</w:t>
+      </w:r>
+      <w:r>
+        <w:rPr>
+          <w:rFonts w:ascii="Times New Roman" w:hAnsi="Times New Roman" w:cs="Times New Roman"/>
+          <w:b w:val="0"/>
+          <w:bCs w:val="0"/>
+          <w:color w:val="auto"/>
+          <w:lang w:val="es-CR"/>
+        </w:rPr>
+        <w:t>a</w:t>
+      </w:r>
+      <w:r>
+        <w:rPr>
+          <w:rFonts w:ascii="Times New Roman" w:hAnsi="Times New Roman" w:cs="Times New Roman"/>
+          <w:b w:val="0"/>
+          <w:bCs w:val="0"/>
+          <w:color w:val="auto"/>
+          <w:lang w:val="es-CR"/>
+        </w:rPr>
+        <w:t xml:space="preserve"> poder observar mejor el tema de bloqueos en los parqueos cuales están libres</w:t>
+      </w:r>
+      <w:r>
+        <w:rPr>
+          <w:rFonts w:ascii="Times New Roman" w:hAnsi="Times New Roman" w:cs="Times New Roman"/>
+          <w:b w:val="0"/>
+          <w:bCs w:val="0"/>
+          <w:color w:val="auto"/>
+          <w:lang w:val="es-CR"/>
+        </w:rPr>
+        <w:t xml:space="preserve"> y </w:t>
+      </w:r>
+      <w:r>
+        <w:rPr>
+          <w:rFonts w:ascii="Times New Roman" w:hAnsi="Times New Roman" w:cs="Times New Roman"/>
+          <w:b w:val="0"/>
+          <w:bCs w:val="0"/>
+          <w:color w:val="auto"/>
+          <w:lang w:val="es-CR"/>
+        </w:rPr>
+        <w:t xml:space="preserve">manejar </w:t>
+      </w:r>
+      <w:r>
+        <w:rPr>
+          <w:rFonts w:ascii="Times New Roman" w:hAnsi="Times New Roman" w:cs="Times New Roman"/>
+          <w:b w:val="0"/>
+          <w:bCs w:val="0"/>
+          <w:color w:val="auto"/>
+          <w:lang w:val="es-CR"/>
+        </w:rPr>
+        <w:t>los cobro</w:t>
+      </w:r>
+      <w:r>
+        <w:rPr>
+          <w:rFonts w:ascii="Times New Roman" w:hAnsi="Times New Roman" w:cs="Times New Roman"/>
+          <w:b w:val="0"/>
+          <w:bCs w:val="0"/>
+          <w:color w:val="auto"/>
+          <w:lang w:val="es-CR"/>
+        </w:rPr>
+        <w:t xml:space="preserve">s dentro de la interfaz de una manera </w:t>
+      </w:r>
+      <w:proofErr w:type="spellStart"/>
+      <w:r>
+        <w:rPr>
+          <w:rFonts w:ascii="Times New Roman" w:hAnsi="Times New Roman" w:cs="Times New Roman"/>
+          <w:b w:val="0"/>
+          <w:bCs w:val="0"/>
+          <w:color w:val="auto"/>
+          <w:lang w:val="es-CR"/>
+        </w:rPr>
+        <w:t>mas</w:t>
+      </w:r>
+      <w:proofErr w:type="spellEnd"/>
+      <w:r>
+        <w:rPr>
+          <w:rFonts w:ascii="Times New Roman" w:hAnsi="Times New Roman" w:cs="Times New Roman"/>
+          <w:b w:val="0"/>
+          <w:bCs w:val="0"/>
+          <w:color w:val="auto"/>
+          <w:lang w:val="es-CR"/>
+        </w:rPr>
+        <w:t xml:space="preserve"> </w:t>
+      </w:r>
+      <w:proofErr w:type="spellStart"/>
+      <w:r>
+        <w:rPr>
+          <w:rFonts w:ascii="Times New Roman" w:hAnsi="Times New Roman" w:cs="Times New Roman"/>
+          <w:b w:val="0"/>
+          <w:bCs w:val="0"/>
+          <w:color w:val="auto"/>
+          <w:lang w:val="es-CR"/>
+        </w:rPr>
+        <w:t>dimanica</w:t>
+      </w:r>
+      <w:proofErr w:type="spellEnd"/>
+      <w:r>
+        <w:rPr>
+          <w:rFonts w:ascii="Times New Roman" w:hAnsi="Times New Roman" w:cs="Times New Roman"/>
+          <w:b w:val="0"/>
+          <w:bCs w:val="0"/>
+          <w:color w:val="auto"/>
+          <w:lang w:val="es-CR"/>
+        </w:rPr>
+        <w:t xml:space="preserve"> </w:t>
+      </w:r>
+      <w:r>
+        <w:rPr>
+          <w:rFonts w:ascii="Times New Roman" w:hAnsi="Times New Roman" w:cs="Times New Roman"/>
+          <w:b w:val="0"/>
+          <w:bCs w:val="0"/>
+          <w:color w:val="auto"/>
+          <w:lang w:val="es-CR"/>
+        </w:rPr>
+        <w:t xml:space="preserve">y </w:t>
+      </w:r>
+      <w:proofErr w:type="gramStart"/>
+      <w:r>
+        <w:rPr>
+          <w:rFonts w:ascii="Times New Roman" w:hAnsi="Times New Roman" w:cs="Times New Roman"/>
+          <w:b w:val="0"/>
+          <w:bCs w:val="0"/>
+          <w:color w:val="auto"/>
+          <w:lang w:val="es-CR"/>
+        </w:rPr>
+        <w:t>sencilla</w:t>
+      </w:r>
+      <w:r>
+        <w:rPr>
+          <w:rFonts w:ascii="Times New Roman" w:hAnsi="Times New Roman" w:cs="Times New Roman"/>
+          <w:b w:val="0"/>
+          <w:bCs w:val="0"/>
+          <w:color w:val="auto"/>
+          <w:lang w:val="es-CR"/>
+        </w:rPr>
+        <w:t xml:space="preserve"> ,</w:t>
+      </w:r>
+      <w:proofErr w:type="gramEnd"/>
+      <w:r>
+        <w:rPr>
+          <w:rFonts w:ascii="Times New Roman" w:hAnsi="Times New Roman" w:cs="Times New Roman"/>
+          <w:b w:val="0"/>
+          <w:bCs w:val="0"/>
+          <w:color w:val="auto"/>
+          <w:lang w:val="es-CR"/>
+        </w:rPr>
+        <w:t xml:space="preserve"> esas son cosa</w:t>
+      </w:r>
+      <w:r>
+        <w:rPr>
+          <w:rFonts w:ascii="Times New Roman" w:hAnsi="Times New Roman" w:cs="Times New Roman"/>
+          <w:b w:val="0"/>
+          <w:bCs w:val="0"/>
+          <w:color w:val="auto"/>
+          <w:lang w:val="es-CR"/>
+        </w:rPr>
+        <w:t>s</w:t>
+      </w:r>
+      <w:r>
+        <w:rPr>
+          <w:rFonts w:ascii="Times New Roman" w:hAnsi="Times New Roman" w:cs="Times New Roman"/>
+          <w:b w:val="0"/>
+          <w:bCs w:val="0"/>
+          <w:color w:val="auto"/>
+          <w:lang w:val="es-CR"/>
+        </w:rPr>
+        <w:t xml:space="preserve"> que se podrían realizar con un poco mas de tie</w:t>
+      </w:r>
+      <w:r>
+        <w:rPr>
+          <w:rFonts w:ascii="Times New Roman" w:hAnsi="Times New Roman" w:cs="Times New Roman"/>
+          <w:b w:val="0"/>
+          <w:bCs w:val="0"/>
+          <w:color w:val="auto"/>
+          <w:lang w:val="es-CR"/>
+        </w:rPr>
+        <w:t>m</w:t>
+      </w:r>
+      <w:r>
+        <w:rPr>
+          <w:rFonts w:ascii="Times New Roman" w:hAnsi="Times New Roman" w:cs="Times New Roman"/>
+          <w:b w:val="0"/>
+          <w:bCs w:val="0"/>
+          <w:color w:val="auto"/>
+          <w:lang w:val="es-CR"/>
+        </w:rPr>
+        <w:t>po</w:t>
       </w:r>
     </w:p>
     <w:p>

</xml_diff>

<commit_message>
diagrama en archivo informe de docs
</commit_message>
<xml_diff>
--- a/Informe_Parking_Coto.docx
+++ b/Informe_Parking_Coto.docx
@@ -2794,37 +2794,13 @@
           <w:szCs w:val="24"/>
         </w:rPr>
       </w:pPr>
-    </w:p>
-    <w:p>
-      <w:pPr>
-        <w:pStyle w:val="Ttulo1"/>
-        <w:keepNext/>
-        <w:rPr>
-          <w:rFonts w:ascii="Times New Roman" w:hAnsi="Times New Roman" w:cs="Times New Roman"/>
-          <w:color w:val="auto"/>
-          <w:sz w:val="24"/>
-          <w:szCs w:val="24"/>
-        </w:rPr>
-      </w:pPr>
-    </w:p>
-    <w:p>
-      <w:pPr>
-        <w:pStyle w:val="Ttulo1"/>
-        <w:keepNext/>
-        <w:rPr>
-          <w:rFonts w:ascii="Times New Roman" w:hAnsi="Times New Roman" w:cs="Times New Roman"/>
-          <w:color w:val="auto"/>
-          <w:sz w:val="24"/>
-          <w:szCs w:val="24"/>
-        </w:rPr>
-      </w:pPr>
       <w:r>
         <w:rPr>
           <w:noProof/>
         </w:rPr>
         <w:lastRenderedPageBreak/>
         <w:drawing>
-          <wp:inline distT="0" distB="0" distL="0" distR="0" wp14:anchorId="6BDE6B92" wp14:editId="45B07D60">
+          <wp:inline distT="0" distB="0" distL="0" distR="0" wp14:anchorId="6BDE6B92" wp14:editId="4A9EFE3F">
             <wp:extent cx="8543290" cy="6858000"/>
             <wp:effectExtent l="0" t="0" r="0" b="0"/>
             <wp:docPr id="2104656798" name="Imagen 1"/>
@@ -2913,7 +2889,7 @@
           <w:sz w:val="24"/>
           <w:szCs w:val="24"/>
         </w:rPr>
-        <w:t>Fuente: docs/parking-</w:t>
+        <w:t xml:space="preserve">Fuente: </w:t>
       </w:r>
       <w:proofErr w:type="spellStart"/>
       <w:r>
@@ -2924,16 +2900,64 @@
           <w:sz w:val="24"/>
           <w:szCs w:val="24"/>
         </w:rPr>
-        <w:t>coto.puml</w:t>
+        <w:t>uml</w:t>
       </w:r>
       <w:proofErr w:type="spellEnd"/>
+      <w:r>
+        <w:rPr>
+          <w:rFonts w:ascii="Times New Roman" w:hAnsi="Times New Roman" w:cs="Times New Roman"/>
+          <w:i/>
+          <w:iCs/>
+          <w:sz w:val="24"/>
+          <w:szCs w:val="24"/>
+        </w:rPr>
+        <w:t xml:space="preserve"> class diagram -java</w:t>
+      </w:r>
+      <w:r>
+        <w:rPr>
+          <w:rFonts w:ascii="Times New Roman" w:hAnsi="Times New Roman" w:cs="Times New Roman"/>
+          <w:i/>
+          <w:iCs/>
+          <w:sz w:val="24"/>
+          <w:szCs w:val="24"/>
+        </w:rPr>
+        <w:t xml:space="preserve"> id21</w:t>
+      </w:r>
     </w:p>
     <w:p>
       <w:pPr>
         <w:rPr>
           <w:rFonts w:ascii="Times New Roman" w:hAnsi="Times New Roman" w:cs="Times New Roman"/>
-          <w:sz w:val="24"/>
-          <w:szCs w:val="24"/>
+          <w:i/>
+          <w:iCs/>
+          <w:sz w:val="24"/>
+          <w:szCs w:val="24"/>
+          <w:lang w:val="es-CR"/>
+        </w:rPr>
+      </w:pPr>
+    </w:p>
+    <w:p>
+      <w:pPr>
+        <w:rPr>
+          <w:rFonts w:ascii="Times New Roman" w:hAnsi="Times New Roman" w:cs="Times New Roman"/>
+          <w:sz w:val="24"/>
+          <w:szCs w:val="24"/>
+          <w:lang w:val="es-CR"/>
+        </w:rPr>
+      </w:pPr>
+    </w:p>
+    <w:p>
+      <w:pPr>
+        <w:tabs>
+          <w:tab w:val="left" w:pos="2970"/>
+        </w:tabs>
+        <w:rPr>
+          <w:rFonts w:ascii="Times New Roman" w:hAnsi="Times New Roman" w:cs="Times New Roman"/>
+          <w:i/>
+          <w:iCs/>
+          <w:sz w:val="24"/>
+          <w:szCs w:val="24"/>
+          <w:lang w:val="es-CR"/>
         </w:rPr>
         <w:sectPr>
           <w:footerReference w:type="default" r:id="rId9"/>

</xml_diff>